<commit_message>
Add table of contents to document
</commit_message>
<xml_diff>
--- a/ALT-1-FD-001.docx
+++ b/ALT-1-FD-001.docx
@@ -1014,6 +1014,659 @@
       <w:r>
         <w:rPr/>
       </w:r>
+    </w:p>
+    <w:sdt>
+      <w:sdtPr>
+        <w:docPartObj>
+          <w:docPartGallery w:val="Table of Contents"/>
+          <w:docPartUnique w:val="true"/>
+        </w:docPartObj>
+      </w:sdtPr>
+      <w:sdtContent>
+        <w:p>
+          <w:pPr>
+            <w:pStyle w:val="TOCHeading"/>
+            <w:rPr/>
+          </w:pPr>
+          <w:r>
+            <w:br w:type="page"/>
+          </w:r>
+          <w:r>
+            <w:rPr/>
+            <w:t>Table of Contents</w:t>
+          </w:r>
+        </w:p>
+        <w:p>
+          <w:pPr>
+            <w:pStyle w:val="TOC1"/>
+            <w:tabs>
+              <w:tab w:val="clear" w:pos="9026"/>
+              <w:tab w:val="right" w:pos="9025" w:leader="dot"/>
+            </w:tabs>
+            <w:rPr/>
+          </w:pPr>
+          <w:r>
+            <w:fldChar w:fldCharType="begin"/>
+          </w:r>
+          <w:r>
+            <w:rPr>
+              <w:rStyle w:val="IndexLink"/>
+            </w:rPr>
+            <w:instrText xml:space="preserve"> TOC \o "1-9" \h</w:instrText>
+          </w:r>
+          <w:r>
+            <w:rPr>
+              <w:rStyle w:val="IndexLink"/>
+            </w:rPr>
+            <w:fldChar w:fldCharType="separate"/>
+          </w:r>
+          <w:hyperlink w:anchor="__RefHeading___Toc1863_2904171520" w:tooltip="Introduction">
+            <w:r>
+              <w:rPr>
+                <w:rStyle w:val="IndexLink"/>
+              </w:rPr>
+              <w:t>1. Introduction</w:t>
+              <w:tab/>
+              <w:t>3</w:t>
+            </w:r>
+          </w:hyperlink>
+        </w:p>
+        <w:p>
+          <w:pPr>
+            <w:pStyle w:val="TOC2"/>
+            <w:tabs>
+              <w:tab w:val="clear" w:pos="8743"/>
+              <w:tab w:val="right" w:pos="9025" w:leader="dot"/>
+            </w:tabs>
+            <w:rPr/>
+          </w:pPr>
+          <w:hyperlink w:anchor="__RefHeading___Toc1865_2904171520" w:tooltip="Purpose">
+            <w:r>
+              <w:rPr>
+                <w:rStyle w:val="IndexLink"/>
+              </w:rPr>
+              <w:t>1.1 Purpose</w:t>
+              <w:tab/>
+              <w:t>3</w:t>
+            </w:r>
+          </w:hyperlink>
+        </w:p>
+        <w:p>
+          <w:pPr>
+            <w:pStyle w:val="TOC2"/>
+            <w:tabs>
+              <w:tab w:val="clear" w:pos="8743"/>
+              <w:tab w:val="right" w:pos="9025" w:leader="dot"/>
+            </w:tabs>
+            <w:rPr/>
+          </w:pPr>
+          <w:hyperlink w:anchor="__RefHeading___Toc1867_2904171520" w:tooltip="Scope">
+            <w:r>
+              <w:rPr>
+                <w:rStyle w:val="IndexLink"/>
+              </w:rPr>
+              <w:t>1.2 Scope</w:t>
+              <w:tab/>
+              <w:t>3</w:t>
+            </w:r>
+          </w:hyperlink>
+        </w:p>
+        <w:p>
+          <w:pPr>
+            <w:pStyle w:val="TOC2"/>
+            <w:tabs>
+              <w:tab w:val="clear" w:pos="8743"/>
+              <w:tab w:val="right" w:pos="9025" w:leader="dot"/>
+            </w:tabs>
+            <w:rPr/>
+          </w:pPr>
+          <w:hyperlink w:anchor="__RefHeading___Toc1869_2904171520" w:tooltip="Definitions">
+            <w:r>
+              <w:rPr>
+                <w:rStyle w:val="IndexLink"/>
+              </w:rPr>
+              <w:t>1.3 Definitions</w:t>
+              <w:tab/>
+              <w:t>3</w:t>
+            </w:r>
+          </w:hyperlink>
+        </w:p>
+        <w:p>
+          <w:pPr>
+            <w:pStyle w:val="TOC1"/>
+            <w:tabs>
+              <w:tab w:val="clear" w:pos="9026"/>
+              <w:tab w:val="right" w:pos="9025" w:leader="dot"/>
+            </w:tabs>
+            <w:rPr/>
+          </w:pPr>
+          <w:hyperlink w:anchor="__RefHeading___Toc1871_2904171520" w:tooltip="Machine overview">
+            <w:r>
+              <w:rPr>
+                <w:rStyle w:val="IndexLink"/>
+              </w:rPr>
+              <w:t>2. Machine overview</w:t>
+              <w:tab/>
+              <w:t>3</w:t>
+            </w:r>
+          </w:hyperlink>
+        </w:p>
+        <w:p>
+          <w:pPr>
+            <w:pStyle w:val="TOC2"/>
+            <w:tabs>
+              <w:tab w:val="clear" w:pos="8743"/>
+              <w:tab w:val="right" w:pos="9025" w:leader="dot"/>
+            </w:tabs>
+            <w:rPr/>
+          </w:pPr>
+          <w:hyperlink w:anchor="__RefHeading___Toc1873_2904171520" w:tooltip="Product">
+            <w:r>
+              <w:rPr>
+                <w:rStyle w:val="IndexLink"/>
+              </w:rPr>
+              <w:t>2.1 Product</w:t>
+              <w:tab/>
+              <w:t>3</w:t>
+            </w:r>
+          </w:hyperlink>
+        </w:p>
+        <w:p>
+          <w:pPr>
+            <w:pStyle w:val="TOC2"/>
+            <w:tabs>
+              <w:tab w:val="clear" w:pos="8743"/>
+              <w:tab w:val="right" w:pos="9025" w:leader="dot"/>
+            </w:tabs>
+            <w:rPr/>
+          </w:pPr>
+          <w:hyperlink w:anchor="__RefHeading___Toc1875_2904171520" w:tooltip="Stations">
+            <w:r>
+              <w:rPr>
+                <w:rStyle w:val="IndexLink"/>
+              </w:rPr>
+              <w:t>2.2 Stations</w:t>
+              <w:tab/>
+              <w:t>4</w:t>
+            </w:r>
+          </w:hyperlink>
+        </w:p>
+        <w:p>
+          <w:pPr>
+            <w:pStyle w:val="TOC1"/>
+            <w:tabs>
+              <w:tab w:val="clear" w:pos="9026"/>
+              <w:tab w:val="right" w:pos="9025" w:leader="dot"/>
+            </w:tabs>
+            <w:rPr/>
+          </w:pPr>
+          <w:hyperlink w:anchor="__RefHeading___Toc1877_2904171520" w:tooltip="Control system architecture">
+            <w:r>
+              <w:rPr>
+                <w:rStyle w:val="IndexLink"/>
+              </w:rPr>
+              <w:t>3. Control system architecture</w:t>
+              <w:tab/>
+              <w:t>4</w:t>
+            </w:r>
+          </w:hyperlink>
+        </w:p>
+        <w:p>
+          <w:pPr>
+            <w:pStyle w:val="TOC2"/>
+            <w:tabs>
+              <w:tab w:val="clear" w:pos="8743"/>
+              <w:tab w:val="right" w:pos="9025" w:leader="dot"/>
+            </w:tabs>
+            <w:rPr/>
+          </w:pPr>
+          <w:hyperlink w:anchor="__RefHeading___Toc1879_2904171520" w:tooltip="Platform">
+            <w:r>
+              <w:rPr>
+                <w:rStyle w:val="IndexLink"/>
+              </w:rPr>
+              <w:t>3.1 Platform</w:t>
+              <w:tab/>
+              <w:t>4</w:t>
+            </w:r>
+          </w:hyperlink>
+        </w:p>
+        <w:p>
+          <w:pPr>
+            <w:pStyle w:val="TOC2"/>
+            <w:tabs>
+              <w:tab w:val="clear" w:pos="8743"/>
+              <w:tab w:val="right" w:pos="9025" w:leader="dot"/>
+            </w:tabs>
+            <w:rPr/>
+          </w:pPr>
+          <w:hyperlink w:anchor="__RefHeading___Toc1881_2904171520" w:tooltip="Program structure">
+            <w:r>
+              <w:rPr>
+                <w:rStyle w:val="IndexLink"/>
+              </w:rPr>
+              <w:t>3.2 Program structure</w:t>
+              <w:tab/>
+              <w:t>4</w:t>
+            </w:r>
+          </w:hyperlink>
+        </w:p>
+        <w:p>
+          <w:pPr>
+            <w:pStyle w:val="TOC2"/>
+            <w:tabs>
+              <w:tab w:val="clear" w:pos="8743"/>
+              <w:tab w:val="right" w:pos="9025" w:leader="dot"/>
+            </w:tabs>
+            <w:rPr/>
+          </w:pPr>
+          <w:hyperlink w:anchor="__RefHeading___Toc1883_2904171520" w:tooltip="Timing">
+            <w:r>
+              <w:rPr>
+                <w:rStyle w:val="IndexLink"/>
+              </w:rPr>
+              <w:t>3.3 Timing</w:t>
+              <w:tab/>
+              <w:t>4</w:t>
+            </w:r>
+          </w:hyperlink>
+        </w:p>
+        <w:p>
+          <w:pPr>
+            <w:pStyle w:val="TOC2"/>
+            <w:tabs>
+              <w:tab w:val="clear" w:pos="8743"/>
+              <w:tab w:val="right" w:pos="9025" w:leader="dot"/>
+            </w:tabs>
+            <w:rPr/>
+          </w:pPr>
+          <w:hyperlink w:anchor="__RefHeading___Toc1885_2904171520" w:tooltip="Plant simulator">
+            <w:r>
+              <w:rPr>
+                <w:rStyle w:val="IndexLink"/>
+              </w:rPr>
+              <w:t>3.4 Plant simulator</w:t>
+              <w:tab/>
+              <w:t>5</w:t>
+            </w:r>
+          </w:hyperlink>
+        </w:p>
+        <w:p>
+          <w:pPr>
+            <w:pStyle w:val="TOC1"/>
+            <w:tabs>
+              <w:tab w:val="clear" w:pos="9026"/>
+              <w:tab w:val="right" w:pos="9025" w:leader="dot"/>
+            </w:tabs>
+            <w:rPr/>
+          </w:pPr>
+          <w:hyperlink w:anchor="__RefHeading___Toc1887_2904171520" w:tooltip="Safety">
+            <w:r>
+              <w:rPr>
+                <w:rStyle w:val="IndexLink"/>
+              </w:rPr>
+              <w:t>4. Safety</w:t>
+              <w:tab/>
+              <w:t>5</w:t>
+            </w:r>
+          </w:hyperlink>
+        </w:p>
+        <w:p>
+          <w:pPr>
+            <w:pStyle w:val="TOC1"/>
+            <w:tabs>
+              <w:tab w:val="clear" w:pos="9026"/>
+              <w:tab w:val="right" w:pos="9025" w:leader="dot"/>
+            </w:tabs>
+            <w:rPr/>
+          </w:pPr>
+          <w:hyperlink w:anchor="__RefHeading___Toc1889_2904171520" w:tooltip="Variables and I/O">
+            <w:r>
+              <w:rPr>
+                <w:rStyle w:val="IndexLink"/>
+              </w:rPr>
+              <w:t>5. Variables and I/O</w:t>
+              <w:tab/>
+              <w:t>5</w:t>
+            </w:r>
+          </w:hyperlink>
+        </w:p>
+        <w:p>
+          <w:pPr>
+            <w:pStyle w:val="TOC2"/>
+            <w:tabs>
+              <w:tab w:val="clear" w:pos="8743"/>
+              <w:tab w:val="right" w:pos="9025" w:leader="dot"/>
+            </w:tabs>
+            <w:rPr/>
+          </w:pPr>
+          <w:hyperlink w:anchor="__RefHeading___Toc1891_2904171520" w:tooltip="Inputs">
+            <w:r>
+              <w:rPr>
+                <w:rStyle w:val="IndexLink"/>
+              </w:rPr>
+              <w:t>5.1 Inputs</w:t>
+              <w:tab/>
+              <w:t>6</w:t>
+            </w:r>
+          </w:hyperlink>
+        </w:p>
+        <w:p>
+          <w:pPr>
+            <w:pStyle w:val="TOC2"/>
+            <w:tabs>
+              <w:tab w:val="clear" w:pos="8743"/>
+              <w:tab w:val="right" w:pos="9025" w:leader="dot"/>
+            </w:tabs>
+            <w:rPr/>
+          </w:pPr>
+          <w:hyperlink w:anchor="__RefHeading___Toc1893_2904171520" w:tooltip="Outputs">
+            <w:r>
+              <w:rPr>
+                <w:rStyle w:val="IndexLink"/>
+              </w:rPr>
+              <w:t>5.2 Outputs</w:t>
+              <w:tab/>
+              <w:t>6</w:t>
+            </w:r>
+          </w:hyperlink>
+        </w:p>
+        <w:p>
+          <w:pPr>
+            <w:pStyle w:val="TOC2"/>
+            <w:tabs>
+              <w:tab w:val="clear" w:pos="8743"/>
+              <w:tab w:val="right" w:pos="9025" w:leader="dot"/>
+            </w:tabs>
+            <w:rPr/>
+          </w:pPr>
+          <w:hyperlink w:anchor="__RefHeading___Toc1895_2904171520" w:tooltip="Internal variables">
+            <w:r>
+              <w:rPr>
+                <w:rStyle w:val="IndexLink"/>
+              </w:rPr>
+              <w:t>5.3 Internal variables</w:t>
+              <w:tab/>
+              <w:t>6</w:t>
+            </w:r>
+          </w:hyperlink>
+        </w:p>
+        <w:p>
+          <w:pPr>
+            <w:pStyle w:val="TOC1"/>
+            <w:tabs>
+              <w:tab w:val="clear" w:pos="9026"/>
+              <w:tab w:val="right" w:pos="9025" w:leader="dot"/>
+            </w:tabs>
+            <w:rPr/>
+          </w:pPr>
+          <w:hyperlink w:anchor="__RefHeading___Toc1897_2904171520" w:tooltip="Logic description">
+            <w:r>
+              <w:rPr>
+                <w:rStyle w:val="IndexLink"/>
+              </w:rPr>
+              <w:t>6. Logic description</w:t>
+              <w:tab/>
+              <w:t>7</w:t>
+            </w:r>
+          </w:hyperlink>
+        </w:p>
+        <w:p>
+          <w:pPr>
+            <w:pStyle w:val="TOC2"/>
+            <w:tabs>
+              <w:tab w:val="clear" w:pos="8743"/>
+              <w:tab w:val="right" w:pos="9025" w:leader="dot"/>
+            </w:tabs>
+            <w:rPr/>
+          </w:pPr>
+          <w:hyperlink w:anchor="__RefHeading___Toc1899_2904171520" w:tooltip="Run control">
+            <w:r>
+              <w:rPr>
+                <w:rStyle w:val="IndexLink"/>
+              </w:rPr>
+              <w:t>6.1 Run control</w:t>
+              <w:tab/>
+              <w:t>7</w:t>
+            </w:r>
+          </w:hyperlink>
+        </w:p>
+        <w:p>
+          <w:pPr>
+            <w:pStyle w:val="TOC2"/>
+            <w:tabs>
+              <w:tab w:val="clear" w:pos="8743"/>
+              <w:tab w:val="right" w:pos="9025" w:leader="dot"/>
+            </w:tabs>
+            <w:rPr/>
+          </w:pPr>
+          <w:hyperlink w:anchor="__RefHeading___Toc1901_2904171520" w:tooltip="Machine sequence">
+            <w:r>
+              <w:rPr>
+                <w:rStyle w:val="IndexLink"/>
+              </w:rPr>
+              <w:t>6.2 Machine sequence</w:t>
+              <w:tab/>
+              <w:t>9</w:t>
+            </w:r>
+          </w:hyperlink>
+        </w:p>
+        <w:p>
+          <w:pPr>
+            <w:pStyle w:val="TOC2"/>
+            <w:tabs>
+              <w:tab w:val="clear" w:pos="8743"/>
+              <w:tab w:val="right" w:pos="9025" w:leader="dot"/>
+            </w:tabs>
+            <w:rPr/>
+          </w:pPr>
+          <w:hyperlink w:anchor="__RefHeading___Toc1903_2904171520" w:tooltip="Cap press">
+            <w:r>
+              <w:rPr>
+                <w:rStyle w:val="IndexLink"/>
+              </w:rPr>
+              <w:t>6.3 Cap press</w:t>
+              <w:tab/>
+              <w:t>10</w:t>
+            </w:r>
+          </w:hyperlink>
+        </w:p>
+        <w:p>
+          <w:pPr>
+            <w:pStyle w:val="TOC2"/>
+            <w:tabs>
+              <w:tab w:val="clear" w:pos="8743"/>
+              <w:tab w:val="right" w:pos="9025" w:leader="dot"/>
+            </w:tabs>
+            <w:rPr/>
+          </w:pPr>
+          <w:hyperlink w:anchor="__RefHeading___Toc1905_2904171520" w:tooltip="Status outputs and serial number">
+            <w:r>
+              <w:rPr>
+                <w:rStyle w:val="IndexLink"/>
+              </w:rPr>
+              <w:t>6.4 Status outputs and serial number</w:t>
+              <w:tab/>
+              <w:t>12</w:t>
+            </w:r>
+          </w:hyperlink>
+        </w:p>
+        <w:p>
+          <w:pPr>
+            <w:pStyle w:val="TOC2"/>
+            <w:tabs>
+              <w:tab w:val="clear" w:pos="8743"/>
+              <w:tab w:val="right" w:pos="9025" w:leader="dot"/>
+            </w:tabs>
+            <w:rPr/>
+          </w:pPr>
+          <w:hyperlink w:anchor="__RefHeading___Toc1909_2904171520" w:tooltip="Fault list">
+            <w:r>
+              <w:rPr>
+                <w:rStyle w:val="IndexLink"/>
+              </w:rPr>
+              <w:t>6.5 Fault list</w:t>
+              <w:tab/>
+              <w:t>13</w:t>
+            </w:r>
+          </w:hyperlink>
+        </w:p>
+        <w:p>
+          <w:pPr>
+            <w:pStyle w:val="TOC1"/>
+            <w:tabs>
+              <w:tab w:val="clear" w:pos="9026"/>
+              <w:tab w:val="right" w:pos="9025" w:leader="dot"/>
+            </w:tabs>
+            <w:rPr/>
+          </w:pPr>
+          <w:hyperlink w:anchor="__RefHeading___Toc1911_2904171520" w:tooltip="Factory acceptance test">
+            <w:r>
+              <w:rPr>
+                <w:rStyle w:val="IndexLink"/>
+              </w:rPr>
+              <w:t>7. Factory acceptance test</w:t>
+              <w:tab/>
+              <w:t>13</w:t>
+            </w:r>
+          </w:hyperlink>
+        </w:p>
+        <w:p>
+          <w:pPr>
+            <w:pStyle w:val="TOC2"/>
+            <w:tabs>
+              <w:tab w:val="clear" w:pos="8743"/>
+              <w:tab w:val="right" w:pos="9025" w:leader="dot"/>
+            </w:tabs>
+            <w:rPr/>
+          </w:pPr>
+          <w:hyperlink w:anchor="__RefHeading___Toc1913_2904171520" w:tooltip="Run control">
+            <w:r>
+              <w:rPr>
+                <w:rStyle w:val="IndexLink"/>
+              </w:rPr>
+              <w:t>7.1 Run control</w:t>
+              <w:tab/>
+              <w:t>13</w:t>
+            </w:r>
+          </w:hyperlink>
+        </w:p>
+        <w:p>
+          <w:pPr>
+            <w:pStyle w:val="TOC2"/>
+            <w:tabs>
+              <w:tab w:val="clear" w:pos="8743"/>
+              <w:tab w:val="right" w:pos="9025" w:leader="dot"/>
+            </w:tabs>
+            <w:rPr/>
+          </w:pPr>
+          <w:hyperlink w:anchor="__RefHeading___Toc1915_2904171520" w:tooltip="Cap press">
+            <w:r>
+              <w:rPr>
+                <w:rStyle w:val="IndexLink"/>
+              </w:rPr>
+              <w:t>7.2 Cap press</w:t>
+              <w:tab/>
+              <w:t>14</w:t>
+            </w:r>
+          </w:hyperlink>
+        </w:p>
+        <w:p>
+          <w:pPr>
+            <w:pStyle w:val="TOC2"/>
+            <w:tabs>
+              <w:tab w:val="clear" w:pos="8743"/>
+              <w:tab w:val="right" w:pos="9025" w:leader="dot"/>
+            </w:tabs>
+            <w:rPr/>
+          </w:pPr>
+          <w:hyperlink w:anchor="__RefHeading___Toc1917_2904171520" w:tooltip="Machine sequence">
+            <w:r>
+              <w:rPr>
+                <w:rStyle w:val="IndexLink"/>
+              </w:rPr>
+              <w:t>7.3 Machine sequence</w:t>
+              <w:tab/>
+              <w:t>15</w:t>
+            </w:r>
+          </w:hyperlink>
+        </w:p>
+        <w:p>
+          <w:pPr>
+            <w:pStyle w:val="TOC2"/>
+            <w:tabs>
+              <w:tab w:val="clear" w:pos="8743"/>
+              <w:tab w:val="right" w:pos="9025" w:leader="dot"/>
+            </w:tabs>
+            <w:rPr/>
+          </w:pPr>
+          <w:hyperlink w:anchor="__RefHeading___Toc1919_2904171520" w:tooltip="Status outputs and serial number">
+            <w:r>
+              <w:rPr>
+                <w:rStyle w:val="IndexLink"/>
+              </w:rPr>
+              <w:t>7.4 Status outputs and serial number</w:t>
+              <w:tab/>
+              <w:t>15</w:t>
+            </w:r>
+          </w:hyperlink>
+        </w:p>
+        <w:p>
+          <w:pPr>
+            <w:pStyle w:val="TOC1"/>
+            <w:tabs>
+              <w:tab w:val="clear" w:pos="9026"/>
+              <w:tab w:val="right" w:pos="9025" w:leader="dot"/>
+            </w:tabs>
+            <w:rPr/>
+          </w:pPr>
+          <w:hyperlink w:anchor="__RefHeading___Toc1921_2904171520" w:tooltip="Assumptions and limitations">
+            <w:r>
+              <w:rPr>
+                <w:rStyle w:val="IndexLink"/>
+              </w:rPr>
+              <w:t>8. Assumptions and limitations</w:t>
+              <w:tab/>
+              <w:t>16</w:t>
+            </w:r>
+          </w:hyperlink>
+        </w:p>
+        <w:p>
+          <w:pPr>
+            <w:pStyle w:val="TOC2"/>
+            <w:tabs>
+              <w:tab w:val="clear" w:pos="8743"/>
+              <w:tab w:val="right" w:pos="9025" w:leader="dot"/>
+            </w:tabs>
+            <w:rPr/>
+          </w:pPr>
+          <w:hyperlink w:anchor="__RefHeading___Toc1923_2904171520" w:tooltip="Open items">
+            <w:r>
+              <w:rPr>
+                <w:rStyle w:val="IndexLink"/>
+              </w:rPr>
+              <w:t>Open items</w:t>
+              <w:tab/>
+              <w:t>16</w:t>
+            </w:r>
+          </w:hyperlink>
+          <w:r>
+            <w:rPr>
+              <w:rStyle w:val="IndexLink"/>
+            </w:rPr>
+            <w:fldChar w:fldCharType="end"/>
+          </w:r>
+        </w:p>
+      </w:sdtContent>
+    </w:sdt>
+    <w:p>
+      <w:pPr>
+        <w:pStyle w:val="Normal"/>
+        <w:rPr/>
+      </w:pPr>
+      <w:r>
+        <w:rPr/>
+      </w:r>
       <w:r>
         <w:br w:type="page"/>
       </w:r>
@@ -1028,6 +1681,8 @@
         <w:spacing w:before="0" w:after="160"/>
         <w:rPr/>
       </w:pPr>
+      <w:bookmarkStart w:id="0" w:name="__RefHeading___Toc1863_2904171520"/>
+      <w:bookmarkEnd w:id="0"/>
       <w:r>
         <w:rPr/>
         <w:t>Introduction</w:t>
@@ -1042,6 +1697,8 @@
         </w:numPr>
         <w:rPr/>
       </w:pPr>
+      <w:bookmarkStart w:id="1" w:name="__RefHeading___Toc1865_2904171520"/>
+      <w:bookmarkEnd w:id="1"/>
       <w:r>
         <w:rPr/>
         <w:t>Purpose</w:t>
@@ -1071,6 +1728,8 @@
         </w:numPr>
         <w:rPr/>
       </w:pPr>
+      <w:bookmarkStart w:id="2" w:name="__RefHeading___Toc1867_2904171520"/>
+      <w:bookmarkEnd w:id="2"/>
       <w:r>
         <w:rPr/>
         <w:t>Scope</w:t>
@@ -1305,6 +1964,8 @@
         </w:numPr>
         <w:rPr/>
       </w:pPr>
+      <w:bookmarkStart w:id="3" w:name="__RefHeading___Toc1869_2904171520"/>
+      <w:bookmarkEnd w:id="3"/>
       <w:r>
         <w:rPr/>
         <w:t>Definitions</w:t>
@@ -1692,6 +2353,8 @@
         </w:numPr>
         <w:rPr/>
       </w:pPr>
+      <w:bookmarkStart w:id="4" w:name="__RefHeading___Toc1871_2904171520"/>
+      <w:bookmarkEnd w:id="4"/>
       <w:r>
         <w:rPr/>
         <w:t>Machine overview</w:t>
@@ -1706,6 +2369,8 @@
         </w:numPr>
         <w:rPr/>
       </w:pPr>
+      <w:bookmarkStart w:id="5" w:name="__RefHeading___Toc1873_2904171520"/>
+      <w:bookmarkEnd w:id="5"/>
       <w:r>
         <w:rPr/>
         <w:t>Product</w:t>
@@ -1735,6 +2400,8 @@
         </w:numPr>
         <w:rPr/>
       </w:pPr>
+      <w:bookmarkStart w:id="6" w:name="__RefHeading___Toc1875_2904171520"/>
+      <w:bookmarkEnd w:id="6"/>
       <w:r>
         <w:rPr/>
         <w:t>Stations</w:t>
@@ -1984,7 +2651,7 @@
                 <w:sz w:val="18"/>
                 <w:szCs w:val="18"/>
               </w:rPr>
-              <w:t>4. Unload and sort</w:t>
+              <w:t>4. Unload</w:t>
             </w:r>
           </w:p>
         </w:tc>
@@ -2013,93 +2680,6 @@
         </w:tc>
       </w:tr>
     </w:tbl>
-    <w:p>
-      <w:pPr>
-        <w:pStyle w:val="Normal"/>
-        <w:spacing w:lineRule="auto" w:line="276" w:before="0" w:after="120"/>
-        <w:rPr/>
-      </w:pPr>
-      <w:r>
-        <w:rPr/>
-      </w:r>
-    </w:p>
-    <w:p>
-      <w:pPr>
-        <w:pStyle w:val="Normal"/>
-        <w:pBdr>
-          <w:left w:val="single" w:sz="12" w:space="8" w:color="2E5C8A"/>
-        </w:pBdr>
-        <w:spacing w:lineRule="auto" w:line="276" w:before="60" w:after="160"/>
-        <w:ind w:start="200"/>
-        <w:rPr/>
-      </w:pPr>
-      <w:r>
-        <w:rPr>
-          <w:rFonts w:eastAsia="Arial" w:cs="Arial"/>
-          <w:i/>
-          <w:iCs/>
-          <w:color w:val="333333"/>
-          <w:sz w:val="21"/>
-          <w:szCs w:val="21"/>
-        </w:rPr>
-        <w:t>S</w:t>
-      </w:r>
-      <w:r>
-        <w:rPr>
-          <w:rFonts w:eastAsia="Arial" w:cs="Arial"/>
-          <w:i/>
-          <w:iCs/>
-          <w:color w:val="333333"/>
-          <w:sz w:val="21"/>
-          <w:szCs w:val="21"/>
-        </w:rPr>
-        <w:t xml:space="preserve">implification: pallets do not move between stations, so the cap press acts on the pallet at the load station. On the real machine the guard encloses stations 2, </w:t>
-      </w:r>
-      <w:r>
-        <w:rPr>
-          <w:rFonts w:eastAsia="Arial" w:cs="Arial"/>
-          <w:i/>
-          <w:iCs/>
-          <w:color w:val="333333"/>
-          <w:sz w:val="21"/>
-          <w:szCs w:val="21"/>
-        </w:rPr>
-        <w:t>3,</w:t>
-      </w:r>
-      <w:r>
-        <w:rPr>
-          <w:rFonts w:eastAsia="Arial" w:cs="Arial"/>
-          <w:i/>
-          <w:iCs/>
-          <w:color w:val="333333"/>
-          <w:sz w:val="21"/>
-          <w:szCs w:val="21"/>
-        </w:rPr>
-        <w:t xml:space="preserve"> </w:t>
-      </w:r>
-      <w:r>
-        <w:rPr>
-          <w:rFonts w:eastAsia="Arial" w:cs="Arial"/>
-          <w:i/>
-          <w:iCs/>
-          <w:color w:val="333333"/>
-          <w:sz w:val="21"/>
-          <w:szCs w:val="21"/>
-        </w:rPr>
-        <w:t>and</w:t>
-      </w:r>
-      <w:r>
-        <w:rPr>
-          <w:rFonts w:eastAsia="Arial" w:cs="Arial"/>
-          <w:i/>
-          <w:iCs/>
-          <w:color w:val="333333"/>
-          <w:sz w:val="21"/>
-          <w:szCs w:val="21"/>
-        </w:rPr>
-        <w:t xml:space="preserve"> 4 only, which is why parts can be loaded and unloaded at station 1 with the guard closed.</w:t>
-      </w:r>
-    </w:p>
     <w:p>
       <w:pPr>
         <w:pStyle w:val="Heading1"/>
@@ -2109,6 +2689,8 @@
         </w:numPr>
         <w:rPr/>
       </w:pPr>
+      <w:bookmarkStart w:id="7" w:name="__RefHeading___Toc1877_2904171520"/>
+      <w:bookmarkEnd w:id="7"/>
       <w:r>
         <w:rPr/>
         <w:t>Control system architecture</w:t>
@@ -2123,6 +2705,8 @@
         </w:numPr>
         <w:rPr/>
       </w:pPr>
+      <w:bookmarkStart w:id="8" w:name="__RefHeading___Toc1879_2904171520"/>
+      <w:bookmarkEnd w:id="8"/>
       <w:r>
         <w:rPr/>
         <w:t>Platform</w:t>
@@ -2483,6 +3067,8 @@
         </w:numPr>
         <w:rPr/>
       </w:pPr>
+      <w:bookmarkStart w:id="9" w:name="__RefHeading___Toc1881_2904171520"/>
+      <w:bookmarkEnd w:id="9"/>
       <w:r>
         <w:rPr/>
         <w:t>Program structure</w:t>
@@ -2601,6 +3187,8 @@
         </w:numPr>
         <w:rPr/>
       </w:pPr>
+      <w:bookmarkStart w:id="10" w:name="__RefHeading___Toc1883_2904171520"/>
+      <w:bookmarkEnd w:id="10"/>
       <w:r>
         <w:rPr/>
         <w:t>Timing</w:t>
@@ -2646,6 +3234,8 @@
         </w:numPr>
         <w:rPr/>
       </w:pPr>
+      <w:bookmarkStart w:id="11" w:name="__RefHeading___Toc1885_2904171520"/>
+      <w:bookmarkEnd w:id="11"/>
       <w:r>
         <w:rPr/>
         <w:t>Plant simulator</w:t>
@@ -3114,31 +3704,11 @@
         </w:numPr>
         <w:rPr/>
       </w:pPr>
+      <w:bookmarkStart w:id="12" w:name="__RefHeading___Toc1887_2904171520"/>
+      <w:bookmarkEnd w:id="12"/>
       <w:r>
         <w:rPr/>
         <w:t>Safety</w:t>
-      </w:r>
-    </w:p>
-    <w:p>
-      <w:pPr>
-        <w:pStyle w:val="Normal"/>
-        <w:pBdr>
-          <w:left w:val="single" w:sz="12" w:space="8" w:color="2E5C8A"/>
-        </w:pBdr>
-        <w:spacing w:lineRule="auto" w:line="276" w:before="60" w:after="160"/>
-        <w:ind w:start="200"/>
-        <w:rPr/>
-      </w:pPr>
-      <w:r>
-        <w:rPr>
-          <w:rFonts w:eastAsia="Arial" w:cs="Arial"/>
-          <w:i/>
-          <w:iCs/>
-          <w:color w:val="333333"/>
-          <w:sz w:val="21"/>
-          <w:szCs w:val="21"/>
-        </w:rPr>
-        <w:t>This project models the PLC monitoring side of safety only. It does not implement a safety function and makes no safety claims.</w:t>
       </w:r>
     </w:p>
     <w:p>
@@ -3247,6 +3817,8 @@
         </w:numPr>
         <w:rPr/>
       </w:pPr>
+      <w:bookmarkStart w:id="13" w:name="__RefHeading___Toc1889_2904171520"/>
+      <w:bookmarkEnd w:id="13"/>
       <w:r>
         <w:rPr/>
         <w:t>Variables and I/O</w:t>
@@ -3324,6 +3896,8 @@
         </w:numPr>
         <w:rPr/>
       </w:pPr>
+      <w:bookmarkStart w:id="14" w:name="__RefHeading___Toc1891_2904171520"/>
+      <w:bookmarkEnd w:id="14"/>
       <w:r>
         <w:rPr/>
         <w:t>Inputs</w:t>
@@ -3350,9 +3924,7 @@
         <w:gridCol w:w="1101"/>
       </w:tblGrid>
       <w:tr>
-        <w:trPr>
-          <w:tblHeader w:val="true"/>
-        </w:trPr>
+        <w:trPr/>
         <w:tc>
           <w:tcPr>
             <w:tcW w:w="2100" w:type="dxa"/>
@@ -4616,6 +5188,8 @@
         </w:numPr>
         <w:rPr/>
       </w:pPr>
+      <w:bookmarkStart w:id="15" w:name="__RefHeading___Toc1893_2904171520"/>
+      <w:bookmarkEnd w:id="15"/>
       <w:r>
         <w:rPr/>
         <w:t>Outputs</w:t>
@@ -5172,6 +5746,8 @@
         </w:numPr>
         <w:rPr/>
       </w:pPr>
+      <w:bookmarkStart w:id="16" w:name="__RefHeading___Toc1895_2904171520"/>
+      <w:bookmarkEnd w:id="16"/>
       <w:r>
         <w:rPr/>
         <w:t>Internal variables</w:t>
@@ -6541,6 +7117,8 @@
         </w:numPr>
         <w:rPr/>
       </w:pPr>
+      <w:bookmarkStart w:id="17" w:name="__RefHeading___Toc1897_2904171520"/>
+      <w:bookmarkEnd w:id="17"/>
       <w:r>
         <w:rPr/>
         <w:t>Logic description</w:t>
@@ -6571,6 +7149,8 @@
         </w:numPr>
         <w:rPr/>
       </w:pPr>
+      <w:bookmarkStart w:id="18" w:name="__RefHeading___Toc1899_2904171520"/>
+      <w:bookmarkEnd w:id="18"/>
       <w:r>
         <w:rPr/>
         <w:t>Run control</w:t>
@@ -7139,87 +7719,17 @@
       <w:pPr>
         <w:pStyle w:val="Normal"/>
         <w:spacing w:lineRule="auto" w:line="276" w:before="0" w:after="120"/>
-        <w:rPr/>
-      </w:pPr>
-      <w:r>
-        <w:rPr/>
-      </w:r>
-    </w:p>
-    <w:p>
-      <w:pPr>
-        <w:pStyle w:val="Normal"/>
-        <w:pBdr>
-          <w:left w:val="single" w:sz="12" w:space="8" w:color="2E5C8A"/>
-        </w:pBdr>
-        <w:spacing w:lineRule="auto" w:line="276" w:before="60" w:after="160"/>
-        <w:ind w:start="200"/>
-        <w:rPr/>
-      </w:pPr>
-      <w:r>
-        <w:rPr>
-          <w:rFonts w:eastAsia="Courier New" w:cs="Courier New" w:ascii="Courier New" w:hAnsi="Courier New"/>
-          <w:i/>
-          <w:iCs/>
-          <w:color w:val="333333"/>
-          <w:sz w:val="20"/>
-          <w:szCs w:val="20"/>
-        </w:rPr>
-        <w:t>Stop_PB</w:t>
-      </w:r>
-      <w:r>
-        <w:rPr>
-          <w:rFonts w:eastAsia="Arial" w:cs="Arial"/>
+        <w:rPr>
+          <w:rFonts w:ascii="Arial" w:hAnsi="Arial" w:eastAsia="Arial" w:cs="Arial"/>
           <w:i/>
           <w:iCs/>
           <w:color w:val="333333"/>
           <w:sz w:val="21"/>
           <w:szCs w:val="21"/>
         </w:rPr>
-        <w:t xml:space="preserve"> uses a normally open contact in the program because the physical button is wired normally closed: </w:t>
-      </w:r>
-      <w:r>
-        <w:rPr>
-          <w:rFonts w:eastAsia="Courier New" w:cs="Courier New" w:ascii="Courier New" w:hAnsi="Courier New"/>
-          <w:i/>
-          <w:iCs/>
-          <w:color w:val="333333"/>
-          <w:sz w:val="20"/>
-          <w:szCs w:val="20"/>
-        </w:rPr>
-        <w:t>TRUE</w:t>
-      </w:r>
-      <w:r>
-        <w:rPr>
-          <w:rFonts w:eastAsia="Arial" w:cs="Arial"/>
-          <w:i/>
-          <w:iCs/>
-          <w:color w:val="333333"/>
-          <w:sz w:val="21"/>
-          <w:szCs w:val="21"/>
-        </w:rPr>
-        <w:t xml:space="preserve"> means not pressed. Program contact type and physical wiring are separate things.</w:t>
-      </w:r>
-    </w:p>
-    <w:p>
-      <w:pPr>
-        <w:pStyle w:val="Normal"/>
-        <w:pBdr>
-          <w:left w:val="single" w:sz="12" w:space="8" w:color="2E5C8A"/>
-        </w:pBdr>
-        <w:spacing w:lineRule="auto" w:line="276" w:before="60" w:after="160"/>
-        <w:ind w:start="200"/>
-        <w:rPr/>
       </w:pPr>
       <w:r>
-        <w:rPr>
-          <w:rFonts w:eastAsia="Arial" w:cs="Arial"/>
-          <w:i/>
-          <w:iCs/>
-          <w:color w:val="333333"/>
-          <w:sz w:val="21"/>
-          <w:szCs w:val="21"/>
-        </w:rPr>
-        <w:t>Fault bits are latched in rungs 10 and 11, after rung 1 has run, so a new fault is seen by rung 1 on the following scan. At a 20 ms task interval this delay is acceptable for this machine.</w:t>
+        <w:rPr/>
       </w:r>
     </w:p>
     <w:p>
@@ -7231,6 +7741,8 @@
         </w:numPr>
         <w:rPr/>
       </w:pPr>
+      <w:bookmarkStart w:id="19" w:name="__RefHeading___Toc1901_2904171520"/>
+      <w:bookmarkEnd w:id="19"/>
       <w:r>
         <w:rPr/>
         <w:t>Machine sequence</w:t>
@@ -8668,6 +9180,8 @@
         </w:numPr>
         <w:rPr/>
       </w:pPr>
+      <w:bookmarkStart w:id="20" w:name="__RefHeading___Toc1903_2904171520"/>
+      <w:bookmarkEnd w:id="20"/>
       <w:r>
         <w:rPr/>
         <w:t>Cap press</w:t>
@@ -9336,6 +9850,8 @@
         </w:numPr>
         <w:rPr/>
       </w:pPr>
+      <w:bookmarkStart w:id="21" w:name="__RefHeading___Toc1905_2904171520"/>
+      <w:bookmarkEnd w:id="21"/>
       <w:r>
         <w:rPr/>
         <w:t>Status outputs and serial number</w:t>
@@ -9716,31 +10232,16 @@
     </w:p>
     <w:p>
       <w:pPr>
-        <w:pStyle w:val="Heading2"/>
-        <w:numPr>
-          <w:ilvl w:val="1"/>
-          <w:numId w:val="1"/>
-        </w:numPr>
-        <w:rPr/>
-      </w:pPr>
-      <w:r>
-        <w:rPr/>
-        <w:t>Leak test, recipes and sorting</w:t>
-      </w:r>
-    </w:p>
-    <w:p>
-      <w:pPr>
         <w:pStyle w:val="Normal"/>
         <w:spacing w:lineRule="auto" w:line="276" w:before="0" w:after="120"/>
-        <w:rPr/>
-      </w:pPr>
-      <w:r>
-        <w:rPr>
-          <w:rFonts w:eastAsia="Arial" w:cs="Arial"/>
+        <w:rPr>
+          <w:rFonts w:ascii="Arial" w:hAnsi="Arial" w:eastAsia="Arial" w:cs="Arial"/>
           <w:sz w:val="21"/>
           <w:szCs w:val="21"/>
         </w:rPr>
-        <w:t>TBD. The leak test interface will replace the step 40 stub. Recipes and the unload and sort station follow.</w:t>
+      </w:pPr>
+      <w:r>
+        <w:rPr/>
       </w:r>
     </w:p>
     <w:p>
@@ -9752,6 +10253,8 @@
         </w:numPr>
         <w:rPr/>
       </w:pPr>
+      <w:bookmarkStart w:id="22" w:name="__RefHeading___Toc1909_2904171520"/>
+      <w:bookmarkEnd w:id="22"/>
       <w:r>
         <w:rPr/>
         <w:t>Fault list</w:t>
@@ -9759,7 +10262,7 @@
     </w:p>
     <w:tbl>
       <w:tblPr>
-        <w:tblW w:w="9026" w:type="dxa"/>
+        <w:tblW w:w="9021" w:type="dxa"/>
         <w:jc w:val="start"/>
         <w:tblInd w:w="0" w:type="dxa"/>
         <w:tblLayout w:type="fixed"/>
@@ -9774,7 +10277,7 @@
         <w:gridCol w:w="2400"/>
         <w:gridCol w:w="2500"/>
         <w:gridCol w:w="2525"/>
-        <w:gridCol w:w="1601"/>
+        <w:gridCol w:w="1596"/>
       </w:tblGrid>
       <w:tr>
         <w:trPr>
@@ -9857,7 +10360,7 @@
         </w:tc>
         <w:tc>
           <w:tcPr>
-            <w:tcW w:w="1601" w:type="dxa"/>
+            <w:tcW w:w="1596" w:type="dxa"/>
             <w:tcBorders/>
             <w:shd w:fill="DCE6F1" w:val="clear"/>
           </w:tcPr>
@@ -9953,7 +10456,7 @@
         </w:tc>
         <w:tc>
           <w:tcPr>
-            <w:tcW w:w="1601" w:type="dxa"/>
+            <w:tcW w:w="1596" w:type="dxa"/>
             <w:tcBorders/>
           </w:tcPr>
           <w:p>
@@ -10049,7 +10552,7 @@
         </w:tc>
         <w:tc>
           <w:tcPr>
-            <w:tcW w:w="1601" w:type="dxa"/>
+            <w:tcW w:w="1596" w:type="dxa"/>
             <w:tcBorders/>
             <w:shd w:fill="F3F7FB" w:val="clear"/>
           </w:tcPr>
@@ -10143,7 +10646,7 @@
         </w:tc>
         <w:tc>
           <w:tcPr>
-            <w:tcW w:w="1601" w:type="dxa"/>
+            <w:tcW w:w="1596" w:type="dxa"/>
             <w:tcBorders/>
           </w:tcPr>
           <w:p>
@@ -10239,7 +10742,7 @@
         </w:tc>
         <w:tc>
           <w:tcPr>
-            <w:tcW w:w="1601" w:type="dxa"/>
+            <w:tcW w:w="1596" w:type="dxa"/>
             <w:tcBorders/>
             <w:shd w:fill="F3F7FB" w:val="clear"/>
           </w:tcPr>
@@ -10333,7 +10836,7 @@
         </w:tc>
         <w:tc>
           <w:tcPr>
-            <w:tcW w:w="1601" w:type="dxa"/>
+            <w:tcW w:w="1596" w:type="dxa"/>
             <w:tcBorders/>
           </w:tcPr>
           <w:p>
@@ -10429,7 +10932,7 @@
         </w:tc>
         <w:tc>
           <w:tcPr>
-            <w:tcW w:w="1601" w:type="dxa"/>
+            <w:tcW w:w="1596" w:type="dxa"/>
             <w:tcBorders/>
             <w:shd w:fill="F3F7FB" w:val="clear"/>
           </w:tcPr>
@@ -10523,7 +11026,7 @@
         </w:tc>
         <w:tc>
           <w:tcPr>
-            <w:tcW w:w="1601" w:type="dxa"/>
+            <w:tcW w:w="1596" w:type="dxa"/>
             <w:tcBorders/>
           </w:tcPr>
           <w:p>
@@ -10540,293 +11043,6 @@
                 <w:szCs w:val="18"/>
               </w:rPr>
               <w:t>Implemented</w:t>
-            </w:r>
-          </w:p>
-        </w:tc>
-      </w:tr>
-      <w:tr>
-        <w:trPr>
-          <w:cantSplit w:val="true"/>
-        </w:trPr>
-        <w:tc>
-          <w:tcPr>
-            <w:tcW w:w="2400" w:type="dxa"/>
-            <w:tcBorders/>
-            <w:shd w:fill="F3F7FB" w:val="clear"/>
-          </w:tcPr>
-          <w:p>
-            <w:pPr>
-              <w:pStyle w:val="Normal"/>
-              <w:keepNext w:val="false"/>
-              <w:spacing w:lineRule="auto" w:line="276"/>
-              <w:rPr/>
-            </w:pPr>
-            <w:r>
-              <w:rPr>
-                <w:rFonts w:eastAsia="Arial" w:cs="Arial"/>
-                <w:sz w:val="18"/>
-                <w:szCs w:val="18"/>
-              </w:rPr>
-              <w:t>Leak tester not responding</w:t>
-            </w:r>
-          </w:p>
-        </w:tc>
-        <w:tc>
-          <w:tcPr>
-            <w:tcW w:w="2500" w:type="dxa"/>
-            <w:tcBorders/>
-            <w:shd w:fill="F3F7FB" w:val="clear"/>
-          </w:tcPr>
-          <w:p>
-            <w:pPr>
-              <w:pStyle w:val="Normal"/>
-              <w:keepNext w:val="false"/>
-              <w:spacing w:lineRule="auto" w:line="276"/>
-              <w:rPr/>
-            </w:pPr>
-            <w:r>
-              <w:rPr>
-                <w:rFonts w:eastAsia="Arial" w:cs="Arial"/>
-                <w:sz w:val="18"/>
-                <w:szCs w:val="18"/>
-              </w:rPr>
-              <w:t>TBD</w:t>
-            </w:r>
-          </w:p>
-        </w:tc>
-        <w:tc>
-          <w:tcPr>
-            <w:tcW w:w="2525" w:type="dxa"/>
-            <w:tcBorders/>
-            <w:shd w:fill="F3F7FB" w:val="clear"/>
-          </w:tcPr>
-          <w:p>
-            <w:pPr>
-              <w:pStyle w:val="Normal"/>
-              <w:keepNext w:val="false"/>
-              <w:spacing w:lineRule="auto" w:line="276"/>
-              <w:rPr/>
-            </w:pPr>
-            <w:r>
-              <w:rPr>
-                <w:rFonts w:eastAsia="Arial" w:cs="Arial"/>
-                <w:sz w:val="18"/>
-                <w:szCs w:val="18"/>
-              </w:rPr>
-              <w:t>TBD</w:t>
-            </w:r>
-          </w:p>
-        </w:tc>
-        <w:tc>
-          <w:tcPr>
-            <w:tcW w:w="1601" w:type="dxa"/>
-            <w:tcBorders/>
-            <w:shd w:fill="F3F7FB" w:val="clear"/>
-          </w:tcPr>
-          <w:p>
-            <w:pPr>
-              <w:pStyle w:val="Normal"/>
-              <w:keepNext w:val="false"/>
-              <w:spacing w:lineRule="auto" w:line="276"/>
-              <w:rPr/>
-            </w:pPr>
-            <w:r>
-              <w:rPr>
-                <w:rFonts w:eastAsia="Arial" w:cs="Arial"/>
-                <w:sz w:val="18"/>
-                <w:szCs w:val="18"/>
-              </w:rPr>
-              <w:t>Planned</w:t>
-            </w:r>
-          </w:p>
-        </w:tc>
-      </w:tr>
-      <w:tr>
-        <w:trPr>
-          <w:cantSplit w:val="true"/>
-        </w:trPr>
-        <w:tc>
-          <w:tcPr>
-            <w:tcW w:w="2400" w:type="dxa"/>
-            <w:tcBorders/>
-          </w:tcPr>
-          <w:p>
-            <w:pPr>
-              <w:pStyle w:val="Normal"/>
-              <w:keepNext w:val="false"/>
-              <w:spacing w:lineRule="auto" w:line="276"/>
-              <w:rPr/>
-            </w:pPr>
-            <w:r>
-              <w:rPr>
-                <w:rFonts w:eastAsia="Arial" w:cs="Arial"/>
-                <w:sz w:val="18"/>
-                <w:szCs w:val="18"/>
-              </w:rPr>
-              <w:t>Leak tester fault</w:t>
-            </w:r>
-          </w:p>
-        </w:tc>
-        <w:tc>
-          <w:tcPr>
-            <w:tcW w:w="2500" w:type="dxa"/>
-            <w:tcBorders/>
-          </w:tcPr>
-          <w:p>
-            <w:pPr>
-              <w:pStyle w:val="Normal"/>
-              <w:keepNext w:val="false"/>
-              <w:spacing w:lineRule="auto" w:line="276"/>
-              <w:rPr/>
-            </w:pPr>
-            <w:r>
-              <w:rPr>
-                <w:rFonts w:eastAsia="Arial" w:cs="Arial"/>
-                <w:sz w:val="18"/>
-                <w:szCs w:val="18"/>
-              </w:rPr>
-              <w:t>TBD</w:t>
-            </w:r>
-          </w:p>
-        </w:tc>
-        <w:tc>
-          <w:tcPr>
-            <w:tcW w:w="2525" w:type="dxa"/>
-            <w:tcBorders/>
-          </w:tcPr>
-          <w:p>
-            <w:pPr>
-              <w:pStyle w:val="Normal"/>
-              <w:keepNext w:val="false"/>
-              <w:spacing w:lineRule="auto" w:line="276"/>
-              <w:rPr/>
-            </w:pPr>
-            <w:r>
-              <w:rPr>
-                <w:rFonts w:eastAsia="Arial" w:cs="Arial"/>
-                <w:sz w:val="18"/>
-                <w:szCs w:val="18"/>
-              </w:rPr>
-              <w:t>TBD</w:t>
-            </w:r>
-          </w:p>
-        </w:tc>
-        <w:tc>
-          <w:tcPr>
-            <w:tcW w:w="1601" w:type="dxa"/>
-            <w:tcBorders/>
-          </w:tcPr>
-          <w:p>
-            <w:pPr>
-              <w:pStyle w:val="Normal"/>
-              <w:keepNext w:val="false"/>
-              <w:spacing w:lineRule="auto" w:line="276"/>
-              <w:rPr/>
-            </w:pPr>
-            <w:r>
-              <w:rPr>
-                <w:rFonts w:eastAsia="Arial" w:cs="Arial"/>
-                <w:sz w:val="18"/>
-                <w:szCs w:val="18"/>
-              </w:rPr>
-              <w:t>Planned</w:t>
-            </w:r>
-          </w:p>
-        </w:tc>
-      </w:tr>
-      <w:tr>
-        <w:trPr>
-          <w:cantSplit w:val="true"/>
-        </w:trPr>
-        <w:tc>
-          <w:tcPr>
-            <w:tcW w:w="2400" w:type="dxa"/>
-            <w:tcBorders/>
-            <w:shd w:fill="F3F7FB" w:val="clear"/>
-          </w:tcPr>
-          <w:p>
-            <w:pPr>
-              <w:pStyle w:val="Normal"/>
-              <w:keepNext w:val="false"/>
-              <w:spacing w:lineRule="auto" w:line="276"/>
-              <w:rPr/>
-            </w:pPr>
-            <w:r>
-              <w:rPr>
-                <w:rFonts w:eastAsia="Arial" w:cs="Arial"/>
-                <w:sz w:val="18"/>
-                <w:szCs w:val="18"/>
-              </w:rPr>
-              <w:t>Reject bin full</w:t>
-            </w:r>
-          </w:p>
-        </w:tc>
-        <w:tc>
-          <w:tcPr>
-            <w:tcW w:w="2500" w:type="dxa"/>
-            <w:tcBorders/>
-            <w:shd w:fill="F3F7FB" w:val="clear"/>
-          </w:tcPr>
-          <w:p>
-            <w:pPr>
-              <w:pStyle w:val="Normal"/>
-              <w:keepNext w:val="false"/>
-              <w:spacing w:lineRule="auto" w:line="276"/>
-              <w:rPr/>
-            </w:pPr>
-            <w:r>
-              <w:rPr>
-                <w:rFonts w:eastAsia="Arial" w:cs="Arial"/>
-                <w:sz w:val="18"/>
-                <w:szCs w:val="18"/>
-              </w:rPr>
-              <w:t>TBD</w:t>
-            </w:r>
-          </w:p>
-        </w:tc>
-        <w:tc>
-          <w:tcPr>
-            <w:tcW w:w="2525" w:type="dxa"/>
-            <w:tcBorders/>
-            <w:shd w:fill="F3F7FB" w:val="clear"/>
-          </w:tcPr>
-          <w:p>
-            <w:pPr>
-              <w:pStyle w:val="Normal"/>
-              <w:keepNext w:val="false"/>
-              <w:spacing w:lineRule="auto" w:line="276"/>
-              <w:rPr/>
-            </w:pPr>
-            <w:r>
-              <w:rPr>
-                <w:rFonts w:eastAsia="Arial" w:cs="Arial"/>
-                <w:sz w:val="18"/>
-                <w:szCs w:val="18"/>
-              </w:rPr>
-              <w:t>TBD</w:t>
-            </w:r>
-          </w:p>
-        </w:tc>
-        <w:tc>
-          <w:tcPr>
-            <w:tcW w:w="1601" w:type="dxa"/>
-            <w:tcBorders/>
-            <w:shd w:fill="F3F7FB" w:val="clear"/>
-          </w:tcPr>
-          <w:p>
-            <w:pPr>
-              <w:pStyle w:val="Normal"/>
-              <w:keepNext w:val="false"/>
-              <w:spacing w:lineRule="auto" w:line="276"/>
-              <w:rPr/>
-            </w:pPr>
-            <w:r>
-              <w:rPr>
-                <w:rFonts w:eastAsia="Arial" w:cs="Arial"/>
-                <w:sz w:val="18"/>
-                <w:szCs w:val="18"/>
-              </w:rPr>
-              <w:t>Planned</w:t>
             </w:r>
           </w:p>
         </w:tc>
@@ -10841,6 +11057,8 @@
         </w:numPr>
         <w:rPr/>
       </w:pPr>
+      <w:bookmarkStart w:id="23" w:name="__RefHeading___Toc1911_2904171520"/>
+      <w:bookmarkEnd w:id="23"/>
       <w:r>
         <w:rPr/>
         <w:t>Factory acceptance test</w:t>
@@ -10999,6 +11217,8 @@
         </w:numPr>
         <w:rPr/>
       </w:pPr>
+      <w:bookmarkStart w:id="24" w:name="__RefHeading___Toc1913_2904171520"/>
+      <w:bookmarkEnd w:id="24"/>
       <w:r>
         <w:rPr/>
         <w:t>Run control</w:t>
@@ -12569,6 +12789,8 @@
         </w:numPr>
         <w:rPr/>
       </w:pPr>
+      <w:bookmarkStart w:id="25" w:name="__RefHeading___Toc1915_2904171520"/>
+      <w:bookmarkEnd w:id="25"/>
       <w:r>
         <w:rPr/>
         <w:t>Cap press</w:t>
@@ -14093,54 +14315,17 @@
       <w:pPr>
         <w:pStyle w:val="Normal"/>
         <w:spacing w:lineRule="auto" w:line="276" w:before="0" w:after="120"/>
-        <w:rPr/>
-      </w:pPr>
-      <w:r>
-        <w:rPr/>
-      </w:r>
-    </w:p>
-    <w:p>
-      <w:pPr>
-        <w:pStyle w:val="Normal"/>
-        <w:pBdr>
-          <w:left w:val="single" w:sz="12" w:space="8" w:color="2E5C8A"/>
-        </w:pBdr>
-        <w:spacing w:lineRule="auto" w:line="276" w:before="60" w:after="160"/>
-        <w:ind w:start="200"/>
-        <w:rPr/>
-      </w:pPr>
-      <w:r>
-        <w:rPr>
-          <w:rFonts w:eastAsia="Arial" w:cs="Arial"/>
+        <w:rPr>
+          <w:rFonts w:ascii="Arial" w:hAnsi="Arial" w:eastAsia="Arial" w:cs="Arial"/>
           <w:i/>
           <w:iCs/>
           <w:color w:val="333333"/>
           <w:sz w:val="21"/>
           <w:szCs w:val="21"/>
         </w:rPr>
-        <w:t xml:space="preserve">FAT-11 to FAT-18 test the cap press in isolation by forcing </w:t>
-      </w:r>
-      <w:r>
-        <w:rPr>
-          <w:rFonts w:eastAsia="Courier New" w:cs="Courier New" w:ascii="Courier New" w:hAnsi="Courier New"/>
-          <w:i/>
-          <w:iCs/>
-          <w:color w:val="333333"/>
-          <w:sz w:val="20"/>
-          <w:szCs w:val="20"/>
-        </w:rPr>
-        <w:t>CapPress_Req_Extend</w:t>
-      </w:r>
-      <w:r>
-        <w:rPr>
-          <w:rFonts w:eastAsia="Arial" w:cs="Arial"/>
-          <w:i/>
-          <w:iCs/>
-          <w:color w:val="333333"/>
-          <w:sz w:val="21"/>
-          <w:szCs w:val="21"/>
-        </w:rPr>
-        <w:t>, which overrides the sequence output. They can still be run that way with the sequence in place.</w:t>
+      </w:pPr>
+      <w:r>
+        <w:rPr/>
       </w:r>
     </w:p>
     <w:p>
@@ -14152,6 +14337,8 @@
         </w:numPr>
         <w:rPr/>
       </w:pPr>
+      <w:bookmarkStart w:id="26" w:name="__RefHeading___Toc1917_2904171520"/>
+      <w:bookmarkEnd w:id="26"/>
       <w:r>
         <w:rPr/>
         <w:t>Machine sequence</w:t>
@@ -15477,6 +15664,8 @@
         </w:numPr>
         <w:rPr/>
       </w:pPr>
+      <w:bookmarkStart w:id="27" w:name="__RefHeading___Toc1919_2904171520"/>
+      <w:bookmarkEnd w:id="27"/>
       <w:r>
         <w:rPr/>
         <w:t>Status outputs and serial number</w:t>
@@ -16244,32 +16433,17 @@
       <w:pPr>
         <w:pStyle w:val="Normal"/>
         <w:spacing w:lineRule="auto" w:line="276" w:before="0" w:after="120"/>
-        <w:rPr/>
-      </w:pPr>
-      <w:r>
-        <w:rPr/>
-      </w:r>
-    </w:p>
-    <w:p>
-      <w:pPr>
-        <w:pStyle w:val="Normal"/>
-        <w:pBdr>
-          <w:left w:val="single" w:sz="12" w:space="8" w:color="2E5C8A"/>
-        </w:pBdr>
-        <w:spacing w:lineRule="auto" w:line="276" w:before="60" w:after="160"/>
-        <w:ind w:start="200"/>
-        <w:rPr/>
-      </w:pPr>
-      <w:r>
-        <w:rPr>
-          <w:rFonts w:eastAsia="Arial" w:cs="Arial"/>
+        <w:rPr>
+          <w:rFonts w:ascii="Arial" w:hAnsi="Arial" w:eastAsia="Arial" w:cs="Arial"/>
           <w:i/>
           <w:iCs/>
           <w:color w:val="333333"/>
           <w:sz w:val="21"/>
           <w:szCs w:val="21"/>
         </w:rPr>
-        <w:t>Critical tests: FAT-04 and FAT-09 (no automatic restart), FAT-13 (reset must not clear a fault whose cause is still present) and FAT-24 (an aborted part must not resume).</w:t>
+      </w:pPr>
+      <w:r>
+        <w:rPr/>
       </w:r>
     </w:p>
     <w:p>
@@ -16281,6 +16455,8 @@
         </w:numPr>
         <w:rPr/>
       </w:pPr>
+      <w:bookmarkStart w:id="28" w:name="__RefHeading___Toc1921_2904171520"/>
+      <w:bookmarkEnd w:id="28"/>
       <w:r>
         <w:rPr/>
         <w:t>Assumptions and limitations</w:t>
@@ -16483,6 +16659,8 @@
         <w:pStyle w:val="Heading2"/>
         <w:rPr/>
       </w:pPr>
+      <w:bookmarkStart w:id="29" w:name="__RefHeading___Toc1923_2904171520"/>
+      <w:bookmarkEnd w:id="29"/>
       <w:r>
         <w:rPr/>
         <w:t>Open items</w:t>
@@ -17308,6 +17486,11 @@
       <w:szCs w:val="20"/>
     </w:rPr>
   </w:style>
+  <w:style w:type="character" w:styleId="IndexLink">
+    <w:name w:val="Index Link"/>
+    <w:qFormat/>
+    <w:rPr/>
+  </w:style>
   <w:style w:type="paragraph" w:styleId="Heading">
     <w:name w:val="Heading"/>
     <w:basedOn w:val="Normal"/>
@@ -17437,6 +17620,82 @@
     <w:basedOn w:val="HeaderandFooter"/>
     <w:pPr/>
     <w:rPr/>
+  </w:style>
+  <w:style w:type="paragraph" w:styleId="IndexHeading">
+    <w:name w:val="index heading"/>
+    <w:basedOn w:val="Heading"/>
+    <w:pPr>
+      <w:suppressLineNumbers/>
+      <w:ind w:hanging="0" w:start="0"/>
+    </w:pPr>
+    <w:rPr>
+      <w:b/>
+      <w:bCs/>
+      <w:sz w:val="32"/>
+      <w:szCs w:val="32"/>
+    </w:rPr>
+  </w:style>
+  <w:style w:type="paragraph" w:styleId="TOCHeading">
+    <w:name w:val="TOC Heading"/>
+    <w:basedOn w:val="IndexHeading"/>
+    <w:qFormat/>
+    <w:pPr>
+      <w:suppressLineNumbers/>
+      <w:ind w:hanging="0" w:start="0"/>
+    </w:pPr>
+    <w:rPr>
+      <w:b/>
+      <w:bCs/>
+      <w:sz w:val="32"/>
+      <w:szCs w:val="32"/>
+    </w:rPr>
+  </w:style>
+  <w:style w:type="paragraph" w:styleId="TOC1">
+    <w:name w:val="toc 1"/>
+    <w:basedOn w:val="Index"/>
+    <w:pPr>
+      <w:tabs>
+        <w:tab w:val="clear" w:pos="720"/>
+        <w:tab w:val="right" w:pos="9026" w:leader="dot"/>
+      </w:tabs>
+      <w:ind w:hanging="0" w:start="0"/>
+    </w:pPr>
+    <w:rPr/>
+  </w:style>
+  <w:style w:type="paragraph" w:styleId="TOC2">
+    <w:name w:val="toc 2"/>
+    <w:basedOn w:val="Index"/>
+    <w:pPr>
+      <w:tabs>
+        <w:tab w:val="clear" w:pos="720"/>
+        <w:tab w:val="right" w:pos="8743" w:leader="dot"/>
+      </w:tabs>
+      <w:ind w:hanging="0" w:start="283"/>
+    </w:pPr>
+    <w:rPr/>
+  </w:style>
+  <w:style w:type="paragraph" w:styleId="TableContents">
+    <w:name w:val="Table Contents"/>
+    <w:basedOn w:val="Normal"/>
+    <w:qFormat/>
+    <w:pPr>
+      <w:widowControl w:val="false"/>
+      <w:suppressLineNumbers/>
+    </w:pPr>
+    <w:rPr/>
+  </w:style>
+  <w:style w:type="paragraph" w:styleId="TableHeading">
+    <w:name w:val="Table Heading"/>
+    <w:basedOn w:val="TableContents"/>
+    <w:qFormat/>
+    <w:pPr>
+      <w:suppressLineNumbers/>
+      <w:jc w:val="center"/>
+    </w:pPr>
+    <w:rPr>
+      <w:b/>
+      <w:bCs/>
+    </w:rPr>
   </w:style>
 </w:styles>
 </file>

</xml_diff>